<commit_message>
docs(dpred): todas las páginas del informe en carta vertical
Las figuras del mapa y los bocetos dejan de usar secciones horizontales;
se redibujan con texto más grande para que sigan legibles a 6.5 in.

Co-Authored-By: Claude Opus 5.5 <noreply@anthropic.com>
</commit_message>
<xml_diff>
--- a/docs/PROYECTO/ETAPA 2/DPRED_Proyecto_Etapa2_R.Riera_J.Darder_J.Torres_Git_Interactivo.docx
+++ b/docs/PROYECTO/ETAPA 2/DPRED_Proyecto_Etapa2_R.Riera_J.Darder_J.Torres_Git_Interactivo.docx
@@ -15231,18 +15231,6 @@
     </w:p>
     <w:p>
       <w:pPr>
-        <w:spacing w:before="0" w:after="0" w:line="480" w:lineRule="auto"/>
-        <w:sectPr>
-          <w:headerReference w:type="default" r:id="rId9"/>
-          <w:pgSz w:w="12240" w:h="15840"/>
-          <w:pgMar w:top="1440" w:right="1440" w:bottom="1440" w:left="1440" w:header="720" w:footer="720" w:gutter="0"/>
-          <w:cols w:space="720"/>
-          <w:docGrid w:linePitch="360"/>
-        </w:sectPr>
-      </w:pPr>
-    </w:p>
-    <w:p>
-      <w:pPr>
         <w:keepNext/>
         <w:spacing w:before="0" w:after="0" w:line="480" w:lineRule="auto"/>
         <w:jc w:val="left"/>
@@ -15286,7 +15274,7 @@
         </w:rPr>
         <w:drawing>
           <wp:inline xmlns:a="http://schemas.openxmlformats.org/drawingml/2006/main" xmlns:pic="http://schemas.openxmlformats.org/drawingml/2006/picture">
-            <wp:extent cx="7863840" cy="4858730"/>
+            <wp:extent cx="5943600" cy="4563836"/>
             <wp:docPr id="3" name="Picture 3"/>
             <wp:cNvGraphicFramePr>
               <a:graphicFrameLocks noChangeAspect="1"/>
@@ -15307,7 +15295,7 @@
                   <pic:spPr>
                     <a:xfrm>
                       <a:off x="0" y="0"/>
-                      <a:ext cx="7863840" cy="4858730"/>
+                      <a:ext cx="5943600" cy="4563836"/>
                     </a:xfrm>
                     <a:prstGeom prst="rect"/>
                   </pic:spPr>
@@ -15339,17 +15327,6 @@
         </w:rPr>
         <w:t xml:space="preserve"> Elaboración propia.</w:t>
       </w:r>
-    </w:p>
-    <w:p>
-      <w:pPr>
-        <w:spacing w:before="0" w:after="0" w:line="480" w:lineRule="auto"/>
-        <w:sectPr>
-          <w:pgSz w:w="15840" w:h="12240" w:orient="landscape"/>
-          <w:pgMar w:top="1440" w:right="1440" w:bottom="1440" w:left="1440" w:header="720" w:footer="720" w:gutter="0"/>
-          <w:cols w:space="720"/>
-          <w:docGrid w:linePitch="360"/>
-        </w:sectPr>
-      </w:pPr>
     </w:p>
     <w:p>
       <w:pPr>
@@ -16609,17 +16586,6 @@
     </w:p>
     <w:p>
       <w:pPr>
-        <w:spacing w:before="0" w:after="0" w:line="480" w:lineRule="auto"/>
-        <w:sectPr>
-          <w:pgSz w:w="12240" w:h="15840"/>
-          <w:pgMar w:top="1440" w:right="1440" w:bottom="1440" w:left="1440" w:header="720" w:footer="720" w:gutter="0"/>
-          <w:cols w:space="720"/>
-          <w:docGrid w:linePitch="360"/>
-        </w:sectPr>
-      </w:pPr>
-    </w:p>
-    <w:p>
-      <w:pPr>
         <w:keepNext/>
         <w:spacing w:before="0" w:after="0" w:line="480" w:lineRule="auto"/>
         <w:jc w:val="left"/>
@@ -16663,7 +16629,7 @@
         </w:rPr>
         <w:drawing>
           <wp:inline xmlns:a="http://schemas.openxmlformats.org/drawingml/2006/main" xmlns:pic="http://schemas.openxmlformats.org/drawingml/2006/picture">
-            <wp:extent cx="7589520" cy="4920324"/>
+            <wp:extent cx="5943600" cy="3853266"/>
             <wp:docPr id="5" name="Picture 5"/>
             <wp:cNvGraphicFramePr>
               <a:graphicFrameLocks noChangeAspect="1"/>
@@ -16684,7 +16650,7 @@
                   <pic:spPr>
                     <a:xfrm>
                       <a:off x="0" y="0"/>
-                      <a:ext cx="7589520" cy="4920324"/>
+                      <a:ext cx="5943600" cy="3853266"/>
                     </a:xfrm>
                     <a:prstGeom prst="rect"/>
                   </pic:spPr>
@@ -16719,17 +16685,6 @@
     </w:p>
     <w:p>
       <w:pPr>
-        <w:spacing w:before="0" w:after="0" w:line="480" w:lineRule="auto"/>
-        <w:sectPr>
-          <w:pgSz w:w="15840" w:h="12240" w:orient="landscape"/>
-          <w:pgMar w:top="1440" w:right="1440" w:bottom="1440" w:left="1440" w:header="720" w:footer="720" w:gutter="0"/>
-          <w:cols w:space="720"/>
-          <w:docGrid w:linePitch="360"/>
-        </w:sectPr>
-      </w:pPr>
-    </w:p>
-    <w:p>
-      <w:pPr>
         <w:keepNext/>
         <w:spacing w:before="0" w:after="0" w:line="480" w:lineRule="auto"/>
         <w:jc w:val="left"/>
@@ -16773,7 +16728,7 @@
         </w:rPr>
         <w:drawing>
           <wp:inline xmlns:a="http://schemas.openxmlformats.org/drawingml/2006/main" xmlns:pic="http://schemas.openxmlformats.org/drawingml/2006/picture">
-            <wp:extent cx="7589520" cy="4920324"/>
+            <wp:extent cx="5943600" cy="3853266"/>
             <wp:docPr id="6" name="Picture 6"/>
             <wp:cNvGraphicFramePr>
               <a:graphicFrameLocks noChangeAspect="1"/>
@@ -16794,7 +16749,7 @@
                   <pic:spPr>
                     <a:xfrm>
                       <a:off x="0" y="0"/>
-                      <a:ext cx="7589520" cy="4920324"/>
+                      <a:ext cx="5943600" cy="3853266"/>
                     </a:xfrm>
                     <a:prstGeom prst="rect"/>
                   </pic:spPr>
@@ -16829,17 +16784,6 @@
     </w:p>
     <w:p>
       <w:pPr>
-        <w:spacing w:before="0" w:after="0" w:line="480" w:lineRule="auto"/>
-        <w:sectPr>
-          <w:pgSz w:w="15840" w:h="12240" w:orient="landscape"/>
-          <w:pgMar w:top="1440" w:right="1440" w:bottom="1440" w:left="1440" w:header="720" w:footer="720" w:gutter="0"/>
-          <w:cols w:space="720"/>
-          <w:docGrid w:linePitch="360"/>
-        </w:sectPr>
-      </w:pPr>
-    </w:p>
-    <w:p>
-      <w:pPr>
         <w:keepNext/>
         <w:spacing w:before="0" w:after="0" w:line="480" w:lineRule="auto"/>
         <w:jc w:val="left"/>
@@ -16883,7 +16827,7 @@
         </w:rPr>
         <w:drawing>
           <wp:inline xmlns:a="http://schemas.openxmlformats.org/drawingml/2006/main" xmlns:pic="http://schemas.openxmlformats.org/drawingml/2006/picture">
-            <wp:extent cx="7589520" cy="4920324"/>
+            <wp:extent cx="5943600" cy="3853266"/>
             <wp:docPr id="7" name="Picture 7"/>
             <wp:cNvGraphicFramePr>
               <a:graphicFrameLocks noChangeAspect="1"/>
@@ -16904,7 +16848,7 @@
                   <pic:spPr>
                     <a:xfrm>
                       <a:off x="0" y="0"/>
-                      <a:ext cx="7589520" cy="4920324"/>
+                      <a:ext cx="5943600" cy="3853266"/>
                     </a:xfrm>
                     <a:prstGeom prst="rect"/>
                   </pic:spPr>
@@ -16939,17 +16883,6 @@
     </w:p>
     <w:p>
       <w:pPr>
-        <w:spacing w:before="0" w:after="0" w:line="480" w:lineRule="auto"/>
-        <w:sectPr>
-          <w:pgSz w:w="15840" w:h="12240" w:orient="landscape"/>
-          <w:pgMar w:top="1440" w:right="1440" w:bottom="1440" w:left="1440" w:header="720" w:footer="720" w:gutter="0"/>
-          <w:cols w:space="720"/>
-          <w:docGrid w:linePitch="360"/>
-        </w:sectPr>
-      </w:pPr>
-    </w:p>
-    <w:p>
-      <w:pPr>
         <w:keepNext/>
         <w:spacing w:before="0" w:after="0" w:line="480" w:lineRule="auto"/>
         <w:jc w:val="left"/>
@@ -16993,7 +16926,7 @@
         </w:rPr>
         <w:drawing>
           <wp:inline xmlns:a="http://schemas.openxmlformats.org/drawingml/2006/main" xmlns:pic="http://schemas.openxmlformats.org/drawingml/2006/picture">
-            <wp:extent cx="7589520" cy="4920324"/>
+            <wp:extent cx="5943600" cy="3853266"/>
             <wp:docPr id="8" name="Picture 8"/>
             <wp:cNvGraphicFramePr>
               <a:graphicFrameLocks noChangeAspect="1"/>
@@ -17014,7 +16947,7 @@
                   <pic:spPr>
                     <a:xfrm>
                       <a:off x="0" y="0"/>
-                      <a:ext cx="7589520" cy="4920324"/>
+                      <a:ext cx="5943600" cy="3853266"/>
                     </a:xfrm>
                     <a:prstGeom prst="rect"/>
                   </pic:spPr>
@@ -17049,17 +16982,6 @@
     </w:p>
     <w:p>
       <w:pPr>
-        <w:spacing w:before="0" w:after="0" w:line="480" w:lineRule="auto"/>
-        <w:sectPr>
-          <w:pgSz w:w="15840" w:h="12240" w:orient="landscape"/>
-          <w:pgMar w:top="1440" w:right="1440" w:bottom="1440" w:left="1440" w:header="720" w:footer="720" w:gutter="0"/>
-          <w:cols w:space="720"/>
-          <w:docGrid w:linePitch="360"/>
-        </w:sectPr>
-      </w:pPr>
-    </w:p>
-    <w:p>
-      <w:pPr>
         <w:keepNext/>
         <w:spacing w:before="0" w:after="0" w:line="480" w:lineRule="auto"/>
         <w:jc w:val="left"/>
@@ -17103,7 +17025,7 @@
         </w:rPr>
         <w:drawing>
           <wp:inline xmlns:a="http://schemas.openxmlformats.org/drawingml/2006/main" xmlns:pic="http://schemas.openxmlformats.org/drawingml/2006/picture">
-            <wp:extent cx="7589520" cy="4920324"/>
+            <wp:extent cx="5943600" cy="3853266"/>
             <wp:docPr id="9" name="Picture 9"/>
             <wp:cNvGraphicFramePr>
               <a:graphicFrameLocks noChangeAspect="1"/>
@@ -17124,7 +17046,7 @@
                   <pic:spPr>
                     <a:xfrm>
                       <a:off x="0" y="0"/>
-                      <a:ext cx="7589520" cy="4920324"/>
+                      <a:ext cx="5943600" cy="3853266"/>
                     </a:xfrm>
                     <a:prstGeom prst="rect"/>
                   </pic:spPr>
@@ -17159,17 +17081,6 @@
     </w:p>
     <w:p>
       <w:pPr>
-        <w:spacing w:before="0" w:after="0" w:line="480" w:lineRule="auto"/>
-        <w:sectPr>
-          <w:pgSz w:w="15840" w:h="12240" w:orient="landscape"/>
-          <w:pgMar w:top="1440" w:right="1440" w:bottom="1440" w:left="1440" w:header="720" w:footer="720" w:gutter="0"/>
-          <w:cols w:space="720"/>
-          <w:docGrid w:linePitch="360"/>
-        </w:sectPr>
-      </w:pPr>
-    </w:p>
-    <w:p>
-      <w:pPr>
         <w:keepNext/>
         <w:spacing w:before="0" w:after="0" w:line="480" w:lineRule="auto"/>
         <w:jc w:val="left"/>
@@ -17213,7 +17124,7 @@
         </w:rPr>
         <w:drawing>
           <wp:inline xmlns:a="http://schemas.openxmlformats.org/drawingml/2006/main" xmlns:pic="http://schemas.openxmlformats.org/drawingml/2006/picture">
-            <wp:extent cx="7589520" cy="4920324"/>
+            <wp:extent cx="5943600" cy="3853266"/>
             <wp:docPr id="10" name="Picture 10"/>
             <wp:cNvGraphicFramePr>
               <a:graphicFrameLocks noChangeAspect="1"/>
@@ -17234,7 +17145,7 @@
                   <pic:spPr>
                     <a:xfrm>
                       <a:off x="0" y="0"/>
-                      <a:ext cx="7589520" cy="4920324"/>
+                      <a:ext cx="5943600" cy="3853266"/>
                     </a:xfrm>
                     <a:prstGeom prst="rect"/>
                   </pic:spPr>
@@ -17269,17 +17180,6 @@
     </w:p>
     <w:p>
       <w:pPr>
-        <w:spacing w:before="0" w:after="0" w:line="480" w:lineRule="auto"/>
-        <w:sectPr>
-          <w:pgSz w:w="15840" w:h="12240" w:orient="landscape"/>
-          <w:pgMar w:top="1440" w:right="1440" w:bottom="1440" w:left="1440" w:header="720" w:footer="720" w:gutter="0"/>
-          <w:cols w:space="720"/>
-          <w:docGrid w:linePitch="360"/>
-        </w:sectPr>
-      </w:pPr>
-    </w:p>
-    <w:p>
-      <w:pPr>
         <w:keepNext/>
         <w:spacing w:before="0" w:after="0" w:line="480" w:lineRule="auto"/>
         <w:jc w:val="left"/>
@@ -17323,7 +17223,7 @@
         </w:rPr>
         <w:drawing>
           <wp:inline xmlns:a="http://schemas.openxmlformats.org/drawingml/2006/main" xmlns:pic="http://schemas.openxmlformats.org/drawingml/2006/picture">
-            <wp:extent cx="7589520" cy="4920324"/>
+            <wp:extent cx="5943600" cy="3853266"/>
             <wp:docPr id="11" name="Picture 11"/>
             <wp:cNvGraphicFramePr>
               <a:graphicFrameLocks noChangeAspect="1"/>
@@ -17344,7 +17244,7 @@
                   <pic:spPr>
                     <a:xfrm>
                       <a:off x="0" y="0"/>
-                      <a:ext cx="7589520" cy="4920324"/>
+                      <a:ext cx="5943600" cy="3853266"/>
                     </a:xfrm>
                     <a:prstGeom prst="rect"/>
                   </pic:spPr>
@@ -17376,17 +17276,6 @@
         </w:rPr>
         <w:t xml:space="preserve"> Elaboración propia.</w:t>
       </w:r>
-    </w:p>
-    <w:p>
-      <w:pPr>
-        <w:spacing w:before="0" w:after="0" w:line="480" w:lineRule="auto"/>
-        <w:sectPr>
-          <w:pgSz w:w="15840" w:h="12240" w:orient="landscape"/>
-          <w:pgMar w:top="1440" w:right="1440" w:bottom="1440" w:left="1440" w:header="720" w:footer="720" w:gutter="0"/>
-          <w:cols w:space="720"/>
-          <w:docGrid w:linePitch="360"/>
-        </w:sectPr>
-      </w:pPr>
     </w:p>
     <w:p>
       <w:pPr>
@@ -22683,6 +22572,7 @@
       </w:r>
     </w:p>
     <w:sectPr>
+      <w:headerReference w:type="default" r:id="rId9"/>
       <w:pgSz w:w="12240" w:h="15840"/>
       <w:pgMar w:top="1440" w:right="1440" w:bottom="1440" w:left="1440" w:header="720" w:footer="720" w:gutter="0"/>
       <w:cols w:space="720"/>

</xml_diff>

<commit_message>
docs(dpred): membrete institucional en la portada del informe
Co-Authored-By: Claude Opus 5.5 <noreply@anthropic.com>
</commit_message>
<xml_diff>
--- a/docs/PROYECTO/ETAPA 2/DPRED_Proyecto_Etapa2_R.Riera_J.Darder_J.Torres_Git_Interactivo.docx
+++ b/docs/PROYECTO/ETAPA 2/DPRED_Proyecto_Etapa2_R.Riera_J.Darder_J.Torres_Git_Interactivo.docx
@@ -5,8 +5,86 @@
     <w:p>
       <w:pPr>
         <w:spacing w:before="0" w:after="0" w:line="480" w:lineRule="auto"/>
-        <w:jc w:val="left"/>
+        <w:jc w:val="center"/>
       </w:pPr>
+      <w:r>
+        <w:rPr>
+          <w:rFonts w:ascii="Times New Roman" w:hAnsi="Times New Roman" w:eastAsia="Times New Roman"/>
+          <w:color w:val="000000"/>
+          <w:sz w:val="24"/>
+        </w:rPr>
+        <w:t>República Bolivariana de Venezuela</w:t>
+      </w:r>
+    </w:p>
+    <w:p>
+      <w:pPr>
+        <w:spacing w:before="0" w:after="0" w:line="480" w:lineRule="auto"/>
+        <w:jc w:val="center"/>
+      </w:pPr>
+      <w:r>
+        <w:rPr>
+          <w:rFonts w:ascii="Times New Roman" w:hAnsi="Times New Roman" w:eastAsia="Times New Roman"/>
+          <w:color w:val="000000"/>
+          <w:sz w:val="24"/>
+        </w:rPr>
+        <w:t>Ministerio del Poder Popular para la Educación Universitaria</w:t>
+      </w:r>
+    </w:p>
+    <w:p>
+      <w:pPr>
+        <w:spacing w:before="0" w:after="0" w:line="480" w:lineRule="auto"/>
+        <w:jc w:val="center"/>
+      </w:pPr>
+      <w:r>
+        <w:rPr>
+          <w:rFonts w:ascii="Times New Roman" w:hAnsi="Times New Roman" w:eastAsia="Times New Roman"/>
+          <w:color w:val="000000"/>
+          <w:sz w:val="24"/>
+        </w:rPr>
+        <w:t>Universidad Central de Venezuela</w:t>
+      </w:r>
+    </w:p>
+    <w:p>
+      <w:pPr>
+        <w:spacing w:before="0" w:after="0" w:line="480" w:lineRule="auto"/>
+        <w:jc w:val="center"/>
+      </w:pPr>
+      <w:r>
+        <w:rPr>
+          <w:rFonts w:ascii="Times New Roman" w:hAnsi="Times New Roman" w:eastAsia="Times New Roman"/>
+          <w:color w:val="000000"/>
+          <w:sz w:val="24"/>
+        </w:rPr>
+        <w:t>Facultad de Ciencias</w:t>
+      </w:r>
+    </w:p>
+    <w:p>
+      <w:pPr>
+        <w:spacing w:before="0" w:after="0" w:line="480" w:lineRule="auto"/>
+        <w:jc w:val="center"/>
+      </w:pPr>
+      <w:r>
+        <w:rPr>
+          <w:rFonts w:ascii="Times New Roman" w:hAnsi="Times New Roman" w:eastAsia="Times New Roman"/>
+          <w:color w:val="000000"/>
+          <w:sz w:val="24"/>
+        </w:rPr>
+        <w:t>Escuela de Computación</w:t>
+      </w:r>
+    </w:p>
+    <w:p>
+      <w:pPr>
+        <w:spacing w:before="0" w:after="0" w:line="480" w:lineRule="auto"/>
+        <w:jc w:val="center"/>
+      </w:pPr>
+      <w:r>
+        <w:rPr>
+          <w:rFonts w:ascii="Times New Roman" w:hAnsi="Times New Roman" w:eastAsia="Times New Roman"/>
+          <w:color w:val="000000"/>
+          <w:sz w:val="24"/>
+        </w:rPr>
+        <w:t>Diseño y Prototipado de Recursos Educativos Digitales (DPRED)</w:t>
+      </w:r>
     </w:p>
     <w:p>
       <w:pPr>
@@ -66,7 +144,7 @@
           <w:color w:val="000000"/>
           <w:sz w:val="24"/>
         </w:rPr>
-        <w:t>Escuela de Computación, Facultad de Ciencias, Universidad Central de Venezuela</w:t>
+        <w:t>Informe del Proyecto, Fases I y II</w:t>
       </w:r>
     </w:p>
     <w:p>
@@ -80,21 +158,7 @@
           <w:color w:val="000000"/>
           <w:sz w:val="24"/>
         </w:rPr>
-        <w:t>Diseño y Prototipado de Recursos Educativos Digitales (DPRED): Informe del Proyecto, Fases I y II</w:t>
-      </w:r>
-    </w:p>
-    <w:p>
-      <w:pPr>
-        <w:spacing w:before="0" w:after="0" w:line="480" w:lineRule="auto"/>
-        <w:jc w:val="center"/>
-      </w:pPr>
-      <w:r>
-        <w:rPr>
-          <w:rFonts w:ascii="Times New Roman" w:hAnsi="Times New Roman" w:eastAsia="Times New Roman"/>
-          <w:color w:val="000000"/>
-          <w:sz w:val="24"/>
-        </w:rPr>
-        <w:t>Prof. Felix Urbano y Profa. Yusneyi Carballo Barrera</w:t>
+        <w:t>Prof. Felix Urbano (QEPD) y Profa. Yusneyi Carballo Barrera</w:t>
       </w:r>
     </w:p>
     <w:p>

</xml_diff>

<commit_message>
docs(dpred): la declaración de IAG se limita al desarrollo del software
Co-Authored-By: Claude Opus 5.5 <noreply@anthropic.com>
</commit_message>
<xml_diff>
--- a/docs/PROYECTO/ETAPA 2/DPRED_Proyecto_Etapa2_R.Riera_J.Darder_J.Torres_Git_Interactivo.docx
+++ b/docs/PROYECTO/ETAPA 2/DPRED_Proyecto_Etapa2_R.Riera_J.Darder_J.Torres_Git_Interactivo.docx
@@ -20359,7 +20359,7 @@
                 <w:color w:val="000000"/>
                 <w:sz w:val="20"/>
               </w:rPr>
-              <w:t>Documentación e informe</w:t>
+              <w:t>Documentación del software</w:t>
             </w:r>
           </w:p>
         </w:tc>
@@ -20390,7 +20390,7 @@
                 <w:color w:val="000000"/>
                 <w:sz w:val="20"/>
               </w:rPr>
-              <w:t>Estructuración del informe de la Fase II, figuras (mapa, bocetos, capturas) y redacción preliminar.</w:t>
+              <w:t>Documentación técnica del repositorio y figuras del prototipo (mapa, bocetos, capturas).</w:t>
             </w:r>
           </w:p>
         </w:tc>
@@ -21031,104 +21031,6 @@
               <w:right w:w="100" w:type="dxa"/>
             </w:tcMar>
             <w:tcBorders>
-              <w:top w:val="nil"/>
-              <w:bottom w:val="nil"/>
-              <w:left w:val="nil"/>
-              <w:right w:val="nil"/>
-            </w:tcBorders>
-          </w:tcPr>
-          <w:p>
-            <w:pPr>
-              <w:spacing w:line="240" w:lineRule="auto" w:before="0" w:after="0"/>
-            </w:pPr>
-            <w:r>
-              <w:rPr>
-                <w:rFonts w:ascii="Times New Roman" w:hAnsi="Times New Roman" w:eastAsia="Times New Roman"/>
-                <w:color w:val="000000"/>
-                <w:sz w:val="20"/>
-              </w:rPr>
-              <w:t>4</w:t>
-            </w:r>
-          </w:p>
-        </w:tc>
-        <w:tc>
-          <w:tcPr>
-            <w:tcW w:type="dxa" w:w="5070"/>
-            <w:vAlign w:val="top"/>
-            <w:tcMar>
-              <w:top w:w="60" w:type="dxa"/>
-              <w:bottom w:w="60" w:type="dxa"/>
-              <w:left w:w="100" w:type="dxa"/>
-              <w:right w:w="100" w:type="dxa"/>
-            </w:tcMar>
-            <w:tcBorders>
-              <w:top w:val="nil"/>
-              <w:bottom w:val="nil"/>
-              <w:left w:val="nil"/>
-              <w:right w:val="nil"/>
-            </w:tcBorders>
-          </w:tcPr>
-          <w:p>
-            <w:pPr>
-              <w:spacing w:line="240" w:lineRule="auto" w:before="0" w:after="0"/>
-            </w:pPr>
-            <w:r>
-              <w:rPr>
-                <w:rFonts w:ascii="Times New Roman" w:hAnsi="Times New Roman" w:eastAsia="Times New Roman"/>
-                <w:color w:val="000000"/>
-                <w:sz w:val="20"/>
-              </w:rPr>
-              <w:t>«Si, vamos a incluir los laboratorios ya que son referencia para la documentacion del Software»</w:t>
-            </w:r>
-          </w:p>
-        </w:tc>
-        <w:tc>
-          <w:tcPr>
-            <w:tcW w:type="dxa" w:w="3770"/>
-            <w:vAlign w:val="top"/>
-            <w:tcMar>
-              <w:top w:w="60" w:type="dxa"/>
-              <w:bottom w:w="60" w:type="dxa"/>
-              <w:left w:w="100" w:type="dxa"/>
-              <w:right w:w="100" w:type="dxa"/>
-            </w:tcMar>
-            <w:tcBorders>
-              <w:top w:val="nil"/>
-              <w:bottom w:val="nil"/>
-              <w:left w:val="nil"/>
-              <w:right w:val="nil"/>
-            </w:tcBorders>
-          </w:tcPr>
-          <w:p>
-            <w:pPr>
-              <w:spacing w:line="240" w:lineRule="auto" w:before="0" w:after="0"/>
-            </w:pPr>
-            <w:r>
-              <w:rPr>
-                <w:rFonts w:ascii="Times New Roman" w:hAnsi="Times New Roman" w:eastAsia="Times New Roman"/>
-                <w:color w:val="000000"/>
-                <w:sz w:val="20"/>
-              </w:rPr>
-              <w:t>Incorporación de los laboratorios al repositorio, retirando datos personales y corrigiendo enlaces.</w:t>
-            </w:r>
-          </w:p>
-        </w:tc>
-      </w:tr>
-      <w:tr>
-        <w:trPr>
-          <w:cantSplit/>
-        </w:trPr>
-        <w:tc>
-          <w:tcPr>
-            <w:tcW w:type="dxa" w:w="520"/>
-            <w:vAlign w:val="top"/>
-            <w:tcMar>
-              <w:top w:w="60" w:type="dxa"/>
-              <w:bottom w:w="60" w:type="dxa"/>
-              <w:left w:w="100" w:type="dxa"/>
-              <w:right w:w="100" w:type="dxa"/>
-            </w:tcMar>
-            <w:tcBorders>
               <w:bottom w:val="single" w:sz="8" w:space="0" w:color="000000"/>
               <w:top w:val="nil"/>
               <w:left w:val="nil"/>
@@ -21145,7 +21047,7 @@
                 <w:color w:val="000000"/>
                 <w:sz w:val="20"/>
               </w:rPr>
-              <w:t>5</w:t>
+              <w:t>4</w:t>
             </w:r>
           </w:p>
         </w:tc>
@@ -21176,7 +21078,7 @@
                 <w:color w:val="000000"/>
                 <w:sz w:val="20"/>
               </w:rPr>
-              <w:t>«Ahora tengo el proyecto final que es del: …/docs/PROYECTO, donde tengo las mejoras del desarrollo de la Fase #1, y necesito hacer la Fase #2. Siguiendo las instrucciones que nos comenta la profesora, ya que este proyecto es académico y educativo como podrás ver del directorio. […]»</w:t>
+              <w:t>«Si, vamos a incluir los laboratorios ya que son referencia para la documentacion del Software»</w:t>
             </w:r>
           </w:p>
         </w:tc>
@@ -21207,7 +21109,7 @@
                 <w:color w:val="000000"/>
                 <w:sz w:val="20"/>
               </w:rPr>
-              <w:t>Elaboración de este informe de la Fase II a partir de las instrucciones de la cátedra y del informe corregido de la Fase I.</w:t>
+              <w:t>Incorporación de los laboratorios al repositorio, retirando datos personales y corrigiendo enlaces.</w:t>
             </w:r>
           </w:p>
         </w:tc>

</xml_diff>

<commit_message>
docs(dpred): enlace al MVP en la portada del informe
Co-Authored-By: Claude Opus 5.5 <noreply@anthropic.com>
</commit_message>
<xml_diff>
--- a/docs/PROYECTO/ETAPA 2/DPRED_Proyecto_Etapa2_R.Riera_J.Darder_J.Torres_Git_Interactivo.docx
+++ b/docs/PROYECTO/ETAPA 2/DPRED_Proyecto_Etapa2_R.Riera_J.Darder_J.Torres_Git_Interactivo.docx
@@ -174,6 +174,31 @@
         </w:rPr>
         <w:t>19 de octubre de 2026</w:t>
       </w:r>
+    </w:p>
+    <w:p>
+      <w:pPr>
+        <w:spacing w:before="0" w:after="0" w:line="480" w:lineRule="auto"/>
+        <w:jc w:val="center"/>
+      </w:pPr>
+      <w:r>
+        <w:rPr>
+          <w:rFonts w:ascii="Times New Roman" w:hAnsi="Times New Roman" w:eastAsia="Times New Roman"/>
+          <w:color w:val="000000"/>
+          <w:sz w:val="24"/>
+        </w:rPr>
+        <w:t xml:space="preserve">Prototipo (MVP): </w:t>
+      </w:r>
+      <w:hyperlink r:id="rId10">
+        <w:r>
+          <w:rPr>
+            <w:rFonts w:ascii="Times New Roman" w:hAnsi="Times New Roman" w:cs="Times New Roman" w:eastAsia="Times New Roman"/>
+            <w:color w:val="000000"/>
+            <w:sz w:val="24"/>
+            <w:u w:val="single"/>
+          </w:rPr>
+          <w:t>https://git-playground-ucv.netlify.app/</w:t>
+        </w:r>
+      </w:hyperlink>
     </w:p>
     <w:p>
       <w:pPr>
@@ -6578,7 +6603,7 @@
                     <pic:cNvPicPr/>
                   </pic:nvPicPr>
                   <pic:blipFill>
-                    <a:blip r:embed="rId10"/>
+                    <a:blip r:embed="rId11"/>
                     <a:stretch>
                       <a:fillRect/>
                     </a:stretch>
@@ -11743,7 +11768,7 @@
                     <pic:cNvPicPr/>
                   </pic:nvPicPr>
                   <pic:blipFill>
-                    <a:blip r:embed="rId11"/>
+                    <a:blip r:embed="rId12"/>
                     <a:stretch>
                       <a:fillRect/>
                     </a:stretch>
@@ -15351,7 +15376,7 @@
                     <pic:cNvPicPr/>
                   </pic:nvPicPr>
                   <pic:blipFill>
-                    <a:blip r:embed="rId12"/>
+                    <a:blip r:embed="rId13"/>
                     <a:stretch>
                       <a:fillRect/>
                     </a:stretch>
@@ -16575,7 +16600,7 @@
                     <pic:cNvPicPr/>
                   </pic:nvPicPr>
                   <pic:blipFill>
-                    <a:blip r:embed="rId13"/>
+                    <a:blip r:embed="rId14"/>
                     <a:stretch>
                       <a:fillRect/>
                     </a:stretch>
@@ -16703,105 +16728,6 @@
                 <pic:pic>
                   <pic:nvPicPr>
                     <pic:cNvPr id="0" name="boceto_dashboard.png"/>
-                    <pic:cNvPicPr/>
-                  </pic:nvPicPr>
-                  <pic:blipFill>
-                    <a:blip r:embed="rId14"/>
-                    <a:stretch>
-                      <a:fillRect/>
-                    </a:stretch>
-                  </pic:blipFill>
-                  <pic:spPr>
-                    <a:xfrm>
-                      <a:off x="0" y="0"/>
-                      <a:ext cx="5943600" cy="3853266"/>
-                    </a:xfrm>
-                    <a:prstGeom prst="rect"/>
-                  </pic:spPr>
-                </pic:pic>
-              </a:graphicData>
-            </a:graphic>
-          </wp:inline>
-        </w:drawing>
-      </w:r>
-    </w:p>
-    <w:p>
-      <w:pPr>
-        <w:spacing w:before="0" w:after="0" w:line="480" w:lineRule="auto"/>
-      </w:pPr>
-      <w:r>
-        <w:rPr>
-          <w:rFonts w:ascii="Times New Roman" w:hAnsi="Times New Roman" w:eastAsia="Times New Roman"/>
-          <w:i/>
-          <w:color w:val="000000"/>
-          <w:sz w:val="24"/>
-        </w:rPr>
-        <w:t>Nota.</w:t>
-      </w:r>
-      <w:r>
-        <w:rPr>
-          <w:rFonts w:ascii="Times New Roman" w:hAnsi="Times New Roman" w:eastAsia="Times New Roman"/>
-          <w:color w:val="000000"/>
-          <w:sz w:val="24"/>
-        </w:rPr>
-        <w:t xml:space="preserve"> Elaboración propia.</w:t>
-      </w:r>
-    </w:p>
-    <w:p>
-      <w:pPr>
-        <w:keepNext/>
-        <w:spacing w:before="0" w:after="0" w:line="480" w:lineRule="auto"/>
-        <w:jc w:val="left"/>
-      </w:pPr>
-      <w:r>
-        <w:rPr>
-          <w:rFonts w:ascii="Times New Roman" w:hAnsi="Times New Roman" w:eastAsia="Times New Roman"/>
-          <w:b/>
-          <w:color w:val="000000"/>
-          <w:sz w:val="24"/>
-        </w:rPr>
-        <w:t>Figura 6</w:t>
-      </w:r>
-    </w:p>
-    <w:p>
-      <w:pPr>
-        <w:keepNext/>
-        <w:spacing w:before="0" w:after="0" w:line="480" w:lineRule="auto"/>
-      </w:pPr>
-      <w:r>
-        <w:rPr>
-          <w:rFonts w:ascii="Times New Roman" w:hAnsi="Times New Roman" w:eastAsia="Times New Roman"/>
-          <w:i/>
-          <w:color w:val="000000"/>
-          <w:sz w:val="24"/>
-        </w:rPr>
-        <w:t>Boceto de Lecciones animadas: escenario, terminal y subtítulo, controles, ficha y temario.</w:t>
-      </w:r>
-    </w:p>
-    <w:p>
-      <w:pPr>
-        <w:keepNext/>
-        <w:spacing w:before="0" w:after="0" w:line="480" w:lineRule="auto"/>
-        <w:jc w:val="center"/>
-      </w:pPr>
-      <w:r>
-        <w:rPr>
-          <w:rFonts w:ascii="Times New Roman" w:hAnsi="Times New Roman" w:eastAsia="Times New Roman"/>
-          <w:color w:val="000000"/>
-          <w:sz w:val="24"/>
-        </w:rPr>
-        <w:drawing>
-          <wp:inline xmlns:a="http://schemas.openxmlformats.org/drawingml/2006/main" xmlns:pic="http://schemas.openxmlformats.org/drawingml/2006/picture">
-            <wp:extent cx="5943600" cy="3853266"/>
-            <wp:docPr id="6" name="Picture 6"/>
-            <wp:cNvGraphicFramePr>
-              <a:graphicFrameLocks noChangeAspect="1"/>
-            </wp:cNvGraphicFramePr>
-            <a:graphic>
-              <a:graphicData uri="http://schemas.openxmlformats.org/drawingml/2006/picture">
-                <pic:pic>
-                  <pic:nvPicPr>
-                    <pic:cNvPr id="0" name="boceto_lecciones.png"/>
                     <pic:cNvPicPr/>
                   </pic:nvPicPr>
                   <pic:blipFill>
@@ -16859,7 +16785,7 @@
           <w:color w:val="000000"/>
           <w:sz w:val="24"/>
         </w:rPr>
-        <w:t>Figura 7</w:t>
+        <w:t>Figura 6</w:t>
       </w:r>
     </w:p>
     <w:p>
@@ -16874,7 +16800,7 @@
           <w:color w:val="000000"/>
           <w:sz w:val="24"/>
         </w:rPr>
-        <w:t>Boceto del Simulador Core: misión, tres zonas de estado, grafo vivo y terminal.</w:t>
+        <w:t>Boceto de Lecciones animadas: escenario, terminal y subtítulo, controles, ficha y temario.</w:t>
       </w:r>
     </w:p>
     <w:p>
@@ -16892,7 +16818,7 @@
         <w:drawing>
           <wp:inline xmlns:a="http://schemas.openxmlformats.org/drawingml/2006/main" xmlns:pic="http://schemas.openxmlformats.org/drawingml/2006/picture">
             <wp:extent cx="5943600" cy="3853266"/>
-            <wp:docPr id="7" name="Picture 7"/>
+            <wp:docPr id="6" name="Picture 6"/>
             <wp:cNvGraphicFramePr>
               <a:graphicFrameLocks noChangeAspect="1"/>
             </wp:cNvGraphicFramePr>
@@ -16900,7 +16826,7 @@
               <a:graphicData uri="http://schemas.openxmlformats.org/drawingml/2006/picture">
                 <pic:pic>
                   <pic:nvPicPr>
-                    <pic:cNvPr id="0" name="boceto_simulador.png"/>
+                    <pic:cNvPr id="0" name="boceto_lecciones.png"/>
                     <pic:cNvPicPr/>
                   </pic:nvPicPr>
                   <pic:blipFill>
@@ -16958,7 +16884,7 @@
           <w:color w:val="000000"/>
           <w:sz w:val="24"/>
         </w:rPr>
-        <w:t>Figura 8</w:t>
+        <w:t>Figura 7</w:t>
       </w:r>
     </w:p>
     <w:p>
@@ -16973,7 +16899,7 @@
           <w:color w:val="000000"/>
           <w:sz w:val="24"/>
         </w:rPr>
-        <w:t>Boceto de GitHub &amp; Remotos: repositorio local frente a servidor remoto simulado.</w:t>
+        <w:t>Boceto del Simulador Core: misión, tres zonas de estado, grafo vivo y terminal.</w:t>
       </w:r>
     </w:p>
     <w:p>
@@ -16991,7 +16917,7 @@
         <w:drawing>
           <wp:inline xmlns:a="http://schemas.openxmlformats.org/drawingml/2006/main" xmlns:pic="http://schemas.openxmlformats.org/drawingml/2006/picture">
             <wp:extent cx="5943600" cy="3853266"/>
-            <wp:docPr id="8" name="Picture 8"/>
+            <wp:docPr id="7" name="Picture 7"/>
             <wp:cNvGraphicFramePr>
               <a:graphicFrameLocks noChangeAspect="1"/>
             </wp:cNvGraphicFramePr>
@@ -16999,7 +16925,7 @@
               <a:graphicData uri="http://schemas.openxmlformats.org/drawingml/2006/picture">
                 <pic:pic>
                   <pic:nvPicPr>
-                    <pic:cNvPr id="0" name="boceto_github.png"/>
+                    <pic:cNvPr id="0" name="boceto_simulador.png"/>
                     <pic:cNvPicPr/>
                   </pic:nvPicPr>
                   <pic:blipFill>
@@ -17057,7 +16983,7 @@
           <w:color w:val="000000"/>
           <w:sz w:val="24"/>
         </w:rPr>
-        <w:t>Figura 9</w:t>
+        <w:t>Figura 8</w:t>
       </w:r>
     </w:p>
     <w:p>
@@ -17072,7 +16998,7 @@
           <w:color w:val="000000"/>
           <w:sz w:val="24"/>
         </w:rPr>
-        <w:t>Boceto de Resolución de Conflictos: versiones en paralelo y vista previa con marcadores.</w:t>
+        <w:t>Boceto de GitHub &amp; Remotos: repositorio local frente a servidor remoto simulado.</w:t>
       </w:r>
     </w:p>
     <w:p>
@@ -17090,7 +17016,7 @@
         <w:drawing>
           <wp:inline xmlns:a="http://schemas.openxmlformats.org/drawingml/2006/main" xmlns:pic="http://schemas.openxmlformats.org/drawingml/2006/picture">
             <wp:extent cx="5943600" cy="3853266"/>
-            <wp:docPr id="9" name="Picture 9"/>
+            <wp:docPr id="8" name="Picture 8"/>
             <wp:cNvGraphicFramePr>
               <a:graphicFrameLocks noChangeAspect="1"/>
             </wp:cNvGraphicFramePr>
@@ -17098,7 +17024,7 @@
               <a:graphicData uri="http://schemas.openxmlformats.org/drawingml/2006/picture">
                 <pic:pic>
                   <pic:nvPicPr>
-                    <pic:cNvPr id="0" name="boceto_conflictos.png"/>
+                    <pic:cNvPr id="0" name="boceto_github.png"/>
                     <pic:cNvPicPr/>
                   </pic:nvPicPr>
                   <pic:blipFill>
@@ -17156,7 +17082,7 @@
           <w:color w:val="000000"/>
           <w:sz w:val="24"/>
         </w:rPr>
-        <w:t>Figura 10</w:t>
+        <w:t>Figura 9</w:t>
       </w:r>
     </w:p>
     <w:p>
@@ -17171,7 +17097,7 @@
           <w:color w:val="000000"/>
           <w:sz w:val="24"/>
         </w:rPr>
-        <w:t>Boceto de Desafíos &amp; Quizzes: enunciado, opciones y retroalimentación.</w:t>
+        <w:t>Boceto de Resolución de Conflictos: versiones en paralelo y vista previa con marcadores.</w:t>
       </w:r>
     </w:p>
     <w:p>
@@ -17189,7 +17115,7 @@
         <w:drawing>
           <wp:inline xmlns:a="http://schemas.openxmlformats.org/drawingml/2006/main" xmlns:pic="http://schemas.openxmlformats.org/drawingml/2006/picture">
             <wp:extent cx="5943600" cy="3853266"/>
-            <wp:docPr id="10" name="Picture 10"/>
+            <wp:docPr id="9" name="Picture 9"/>
             <wp:cNvGraphicFramePr>
               <a:graphicFrameLocks noChangeAspect="1"/>
             </wp:cNvGraphicFramePr>
@@ -17197,7 +17123,7 @@
               <a:graphicData uri="http://schemas.openxmlformats.org/drawingml/2006/picture">
                 <pic:pic>
                   <pic:nvPicPr>
-                    <pic:cNvPr id="0" name="boceto_quizzes.png"/>
+                    <pic:cNvPr id="0" name="boceto_conflictos.png"/>
                     <pic:cNvPicPr/>
                   </pic:nvPicPr>
                   <pic:blipFill>
@@ -17255,7 +17181,7 @@
           <w:color w:val="000000"/>
           <w:sz w:val="24"/>
         </w:rPr>
-        <w:t>Figura 11</w:t>
+        <w:t>Figura 10</w:t>
       </w:r>
     </w:p>
     <w:p>
@@ -17270,7 +17196,7 @@
           <w:color w:val="000000"/>
           <w:sz w:val="24"/>
         </w:rPr>
-        <w:t>Boceto en teléfono (375 px): contenido en una columna y menú desplegable con foco atrapado.</w:t>
+        <w:t>Boceto de Desafíos &amp; Quizzes: enunciado, opciones y retroalimentación.</w:t>
       </w:r>
     </w:p>
     <w:p>
@@ -17288,7 +17214,7 @@
         <w:drawing>
           <wp:inline xmlns:a="http://schemas.openxmlformats.org/drawingml/2006/main" xmlns:pic="http://schemas.openxmlformats.org/drawingml/2006/picture">
             <wp:extent cx="5943600" cy="3853266"/>
-            <wp:docPr id="11" name="Picture 11"/>
+            <wp:docPr id="10" name="Picture 10"/>
             <wp:cNvGraphicFramePr>
               <a:graphicFrameLocks noChangeAspect="1"/>
             </wp:cNvGraphicFramePr>
@@ -17296,7 +17222,7 @@
               <a:graphicData uri="http://schemas.openxmlformats.org/drawingml/2006/picture">
                 <pic:pic>
                   <pic:nvPicPr>
-                    <pic:cNvPr id="0" name="boceto_movil.png"/>
+                    <pic:cNvPr id="0" name="boceto_quizzes.png"/>
                     <pic:cNvPicPr/>
                   </pic:nvPicPr>
                   <pic:blipFill>
@@ -17343,6 +17269,105 @@
     </w:p>
     <w:p>
       <w:pPr>
+        <w:keepNext/>
+        <w:spacing w:before="0" w:after="0" w:line="480" w:lineRule="auto"/>
+        <w:jc w:val="left"/>
+      </w:pPr>
+      <w:r>
+        <w:rPr>
+          <w:rFonts w:ascii="Times New Roman" w:hAnsi="Times New Roman" w:eastAsia="Times New Roman"/>
+          <w:b/>
+          <w:color w:val="000000"/>
+          <w:sz w:val="24"/>
+        </w:rPr>
+        <w:t>Figura 11</w:t>
+      </w:r>
+    </w:p>
+    <w:p>
+      <w:pPr>
+        <w:keepNext/>
+        <w:spacing w:before="0" w:after="0" w:line="480" w:lineRule="auto"/>
+      </w:pPr>
+      <w:r>
+        <w:rPr>
+          <w:rFonts w:ascii="Times New Roman" w:hAnsi="Times New Roman" w:eastAsia="Times New Roman"/>
+          <w:i/>
+          <w:color w:val="000000"/>
+          <w:sz w:val="24"/>
+        </w:rPr>
+        <w:t>Boceto en teléfono (375 px): contenido en una columna y menú desplegable con foco atrapado.</w:t>
+      </w:r>
+    </w:p>
+    <w:p>
+      <w:pPr>
+        <w:keepNext/>
+        <w:spacing w:before="0" w:after="0" w:line="480" w:lineRule="auto"/>
+        <w:jc w:val="center"/>
+      </w:pPr>
+      <w:r>
+        <w:rPr>
+          <w:rFonts w:ascii="Times New Roman" w:hAnsi="Times New Roman" w:eastAsia="Times New Roman"/>
+          <w:color w:val="000000"/>
+          <w:sz w:val="24"/>
+        </w:rPr>
+        <w:drawing>
+          <wp:inline xmlns:a="http://schemas.openxmlformats.org/drawingml/2006/main" xmlns:pic="http://schemas.openxmlformats.org/drawingml/2006/picture">
+            <wp:extent cx="5943600" cy="3853266"/>
+            <wp:docPr id="11" name="Picture 11"/>
+            <wp:cNvGraphicFramePr>
+              <a:graphicFrameLocks noChangeAspect="1"/>
+            </wp:cNvGraphicFramePr>
+            <a:graphic>
+              <a:graphicData uri="http://schemas.openxmlformats.org/drawingml/2006/picture">
+                <pic:pic>
+                  <pic:nvPicPr>
+                    <pic:cNvPr id="0" name="boceto_movil.png"/>
+                    <pic:cNvPicPr/>
+                  </pic:nvPicPr>
+                  <pic:blipFill>
+                    <a:blip r:embed="rId21"/>
+                    <a:stretch>
+                      <a:fillRect/>
+                    </a:stretch>
+                  </pic:blipFill>
+                  <pic:spPr>
+                    <a:xfrm>
+                      <a:off x="0" y="0"/>
+                      <a:ext cx="5943600" cy="3853266"/>
+                    </a:xfrm>
+                    <a:prstGeom prst="rect"/>
+                  </pic:spPr>
+                </pic:pic>
+              </a:graphicData>
+            </a:graphic>
+          </wp:inline>
+        </w:drawing>
+      </w:r>
+    </w:p>
+    <w:p>
+      <w:pPr>
+        <w:spacing w:before="0" w:after="0" w:line="480" w:lineRule="auto"/>
+      </w:pPr>
+      <w:r>
+        <w:rPr>
+          <w:rFonts w:ascii="Times New Roman" w:hAnsi="Times New Roman" w:eastAsia="Times New Roman"/>
+          <w:i/>
+          <w:color w:val="000000"/>
+          <w:sz w:val="24"/>
+        </w:rPr>
+        <w:t>Nota.</w:t>
+      </w:r>
+      <w:r>
+        <w:rPr>
+          <w:rFonts w:ascii="Times New Roman" w:hAnsi="Times New Roman" w:eastAsia="Times New Roman"/>
+          <w:color w:val="000000"/>
+          <w:sz w:val="24"/>
+        </w:rPr>
+        <w:t xml:space="preserve"> Elaboración propia.</w:t>
+      </w:r>
+    </w:p>
+    <w:p>
+      <w:pPr>
         <w:spacing w:before="0" w:after="0" w:line="480" w:lineRule="auto"/>
         <w:ind w:firstLine="720"/>
         <w:jc w:val="left"/>
@@ -17411,105 +17436,6 @@
                 <pic:pic>
                   <pic:nvPicPr>
                     <pic:cNvPr id="0" name="captura_01_dashboard.png"/>
-                    <pic:cNvPicPr/>
-                  </pic:nvPicPr>
-                  <pic:blipFill>
-                    <a:blip r:embed="rId21"/>
-                    <a:stretch>
-                      <a:fillRect/>
-                    </a:stretch>
-                  </pic:blipFill>
-                  <pic:spPr>
-                    <a:xfrm>
-                      <a:off x="0" y="0"/>
-                      <a:ext cx="5486400" cy="3429000"/>
-                    </a:xfrm>
-                    <a:prstGeom prst="rect"/>
-                  </pic:spPr>
-                </pic:pic>
-              </a:graphicData>
-            </a:graphic>
-          </wp:inline>
-        </w:drawing>
-      </w:r>
-    </w:p>
-    <w:p>
-      <w:pPr>
-        <w:spacing w:before="0" w:after="0" w:line="480" w:lineRule="auto"/>
-      </w:pPr>
-      <w:r>
-        <w:rPr>
-          <w:rFonts w:ascii="Times New Roman" w:hAnsi="Times New Roman" w:eastAsia="Times New Roman"/>
-          <w:i/>
-          <w:color w:val="000000"/>
-          <w:sz w:val="24"/>
-        </w:rPr>
-        <w:t>Nota.</w:t>
-      </w:r>
-      <w:r>
-        <w:rPr>
-          <w:rFonts w:ascii="Times New Roman" w:hAnsi="Times New Roman" w:eastAsia="Times New Roman"/>
-          <w:color w:val="000000"/>
-          <w:sz w:val="24"/>
-        </w:rPr>
-        <w:t xml:space="preserve"> Captura del prototipo publicado en https://git-playground-ucv.netlify.app..</w:t>
-      </w:r>
-    </w:p>
-    <w:p>
-      <w:pPr>
-        <w:keepNext/>
-        <w:spacing w:before="0" w:after="0" w:line="480" w:lineRule="auto"/>
-        <w:jc w:val="left"/>
-      </w:pPr>
-      <w:r>
-        <w:rPr>
-          <w:rFonts w:ascii="Times New Roman" w:hAnsi="Times New Roman" w:eastAsia="Times New Roman"/>
-          <w:b/>
-          <w:color w:val="000000"/>
-          <w:sz w:val="24"/>
-        </w:rPr>
-        <w:t>Figura 13</w:t>
-      </w:r>
-    </w:p>
-    <w:p>
-      <w:pPr>
-        <w:keepNext/>
-        <w:spacing w:before="0" w:after="0" w:line="480" w:lineRule="auto"/>
-      </w:pPr>
-      <w:r>
-        <w:rPr>
-          <w:rFonts w:ascii="Times New Roman" w:hAnsi="Times New Roman" w:eastAsia="Times New Roman"/>
-          <w:i/>
-          <w:color w:val="000000"/>
-          <w:sz w:val="24"/>
-        </w:rPr>
-        <w:t>Prototipo: Lecciones animadas con el póster de la Lección 1.</w:t>
-      </w:r>
-    </w:p>
-    <w:p>
-      <w:pPr>
-        <w:keepNext/>
-        <w:spacing w:before="0" w:after="0" w:line="480" w:lineRule="auto"/>
-        <w:jc w:val="center"/>
-      </w:pPr>
-      <w:r>
-        <w:rPr>
-          <w:rFonts w:ascii="Times New Roman" w:hAnsi="Times New Roman" w:eastAsia="Times New Roman"/>
-          <w:color w:val="000000"/>
-          <w:sz w:val="24"/>
-        </w:rPr>
-        <w:drawing>
-          <wp:inline xmlns:a="http://schemas.openxmlformats.org/drawingml/2006/main" xmlns:pic="http://schemas.openxmlformats.org/drawingml/2006/picture">
-            <wp:extent cx="5486400" cy="3429000"/>
-            <wp:docPr id="13" name="Picture 13"/>
-            <wp:cNvGraphicFramePr>
-              <a:graphicFrameLocks noChangeAspect="1"/>
-            </wp:cNvGraphicFramePr>
-            <a:graphic>
-              <a:graphicData uri="http://schemas.openxmlformats.org/drawingml/2006/picture">
-                <pic:pic>
-                  <pic:nvPicPr>
-                    <pic:cNvPr id="0" name="captura_02_lecciones.png"/>
                     <pic:cNvPicPr/>
                   </pic:nvPicPr>
                   <pic:blipFill>
@@ -17567,7 +17493,7 @@
           <w:color w:val="000000"/>
           <w:sz w:val="24"/>
         </w:rPr>
-        <w:t>Figura 14</w:t>
+        <w:t>Figura 13</w:t>
       </w:r>
     </w:p>
     <w:p>
@@ -17582,7 +17508,7 @@
           <w:color w:val="000000"/>
           <w:sz w:val="24"/>
         </w:rPr>
-        <w:t>Prototipo: Simulador Core con la Misión 1.</w:t>
+        <w:t>Prototipo: Lecciones animadas con el póster de la Lección 1.</w:t>
       </w:r>
     </w:p>
     <w:p>
@@ -17600,7 +17526,7 @@
         <w:drawing>
           <wp:inline xmlns:a="http://schemas.openxmlformats.org/drawingml/2006/main" xmlns:pic="http://schemas.openxmlformats.org/drawingml/2006/picture">
             <wp:extent cx="5486400" cy="3429000"/>
-            <wp:docPr id="14" name="Picture 14"/>
+            <wp:docPr id="13" name="Picture 13"/>
             <wp:cNvGraphicFramePr>
               <a:graphicFrameLocks noChangeAspect="1"/>
             </wp:cNvGraphicFramePr>
@@ -17608,7 +17534,7 @@
               <a:graphicData uri="http://schemas.openxmlformats.org/drawingml/2006/picture">
                 <pic:pic>
                   <pic:nvPicPr>
-                    <pic:cNvPr id="0" name="captura_03_simulador.png"/>
+                    <pic:cNvPr id="0" name="captura_02_lecciones.png"/>
                     <pic:cNvPicPr/>
                   </pic:nvPicPr>
                   <pic:blipFill>
@@ -17666,6 +17592,105 @@
           <w:color w:val="000000"/>
           <w:sz w:val="24"/>
         </w:rPr>
+        <w:t>Figura 14</w:t>
+      </w:r>
+    </w:p>
+    <w:p>
+      <w:pPr>
+        <w:keepNext/>
+        <w:spacing w:before="0" w:after="0" w:line="480" w:lineRule="auto"/>
+      </w:pPr>
+      <w:r>
+        <w:rPr>
+          <w:rFonts w:ascii="Times New Roman" w:hAnsi="Times New Roman" w:eastAsia="Times New Roman"/>
+          <w:i/>
+          <w:color w:val="000000"/>
+          <w:sz w:val="24"/>
+        </w:rPr>
+        <w:t>Prototipo: Simulador Core con la Misión 1.</w:t>
+      </w:r>
+    </w:p>
+    <w:p>
+      <w:pPr>
+        <w:keepNext/>
+        <w:spacing w:before="0" w:after="0" w:line="480" w:lineRule="auto"/>
+        <w:jc w:val="center"/>
+      </w:pPr>
+      <w:r>
+        <w:rPr>
+          <w:rFonts w:ascii="Times New Roman" w:hAnsi="Times New Roman" w:eastAsia="Times New Roman"/>
+          <w:color w:val="000000"/>
+          <w:sz w:val="24"/>
+        </w:rPr>
+        <w:drawing>
+          <wp:inline xmlns:a="http://schemas.openxmlformats.org/drawingml/2006/main" xmlns:pic="http://schemas.openxmlformats.org/drawingml/2006/picture">
+            <wp:extent cx="5486400" cy="3429000"/>
+            <wp:docPr id="14" name="Picture 14"/>
+            <wp:cNvGraphicFramePr>
+              <a:graphicFrameLocks noChangeAspect="1"/>
+            </wp:cNvGraphicFramePr>
+            <a:graphic>
+              <a:graphicData uri="http://schemas.openxmlformats.org/drawingml/2006/picture">
+                <pic:pic>
+                  <pic:nvPicPr>
+                    <pic:cNvPr id="0" name="captura_03_simulador.png"/>
+                    <pic:cNvPicPr/>
+                  </pic:nvPicPr>
+                  <pic:blipFill>
+                    <a:blip r:embed="rId24"/>
+                    <a:stretch>
+                      <a:fillRect/>
+                    </a:stretch>
+                  </pic:blipFill>
+                  <pic:spPr>
+                    <a:xfrm>
+                      <a:off x="0" y="0"/>
+                      <a:ext cx="5486400" cy="3429000"/>
+                    </a:xfrm>
+                    <a:prstGeom prst="rect"/>
+                  </pic:spPr>
+                </pic:pic>
+              </a:graphicData>
+            </a:graphic>
+          </wp:inline>
+        </w:drawing>
+      </w:r>
+    </w:p>
+    <w:p>
+      <w:pPr>
+        <w:spacing w:before="0" w:after="0" w:line="480" w:lineRule="auto"/>
+      </w:pPr>
+      <w:r>
+        <w:rPr>
+          <w:rFonts w:ascii="Times New Roman" w:hAnsi="Times New Roman" w:eastAsia="Times New Roman"/>
+          <w:i/>
+          <w:color w:val="000000"/>
+          <w:sz w:val="24"/>
+        </w:rPr>
+        <w:t>Nota.</w:t>
+      </w:r>
+      <w:r>
+        <w:rPr>
+          <w:rFonts w:ascii="Times New Roman" w:hAnsi="Times New Roman" w:eastAsia="Times New Roman"/>
+          <w:color w:val="000000"/>
+          <w:sz w:val="24"/>
+        </w:rPr>
+        <w:t xml:space="preserve"> Captura del prototipo publicado en https://git-playground-ucv.netlify.app..</w:t>
+      </w:r>
+    </w:p>
+    <w:p>
+      <w:pPr>
+        <w:keepNext/>
+        <w:spacing w:before="0" w:after="0" w:line="480" w:lineRule="auto"/>
+        <w:jc w:val="left"/>
+      </w:pPr>
+      <w:r>
+        <w:rPr>
+          <w:rFonts w:ascii="Times New Roman" w:hAnsi="Times New Roman" w:eastAsia="Times New Roman"/>
+          <w:b/>
+          <w:color w:val="000000"/>
+          <w:sz w:val="24"/>
+        </w:rPr>
         <w:t>Figura 15</w:t>
       </w:r>
     </w:p>
@@ -17711,7 +17736,7 @@
                     <pic:cNvPicPr/>
                   </pic:nvPicPr>
                   <pic:blipFill>
-                    <a:blip r:embed="rId24"/>
+                    <a:blip r:embed="rId25"/>
                     <a:stretch>
                       <a:fillRect/>
                     </a:stretch>

</xml_diff>